<commit_message>
Resumo de atividade — 10 de setembro de 2026
</commit_message>
<xml_diff>
--- a/Resumo_atividade/Resumo_atividade_SurveyOS_20260910.docx
+++ b/Resumo_atividade/Resumo_atividade_SurveyOS_20260910.docx
@@ -96,7 +96,7 @@
                 <w:sz w:val="24"/>
                 <w:szCs w:val="24"/>
               </w:rPr>
-              <w:t xml:space="preserve">Das 111 ordens avaliadas, 107 foram encerradas. PR concluiu 77 das 78 abertas na região; MG concluiu 20 das 20 abertas na região; SP concluiu 10 das 13 abertas na região. Todas as regiões têm técnico atribuído em ao menos uma ordem.</w:t>
+              <w:t xml:space="preserve">Das 111 ordens avaliadas, 108 foram encerradas. PR concluiu 78 das 78 abertas na região; MG concluiu 20 das 20 abertas na região; SP concluiu 10 das 13 abertas na região. Todas as regiões têm técnico atribuído em ao menos uma ordem.</w:t>
             </w:r>
           </w:p>
         </w:tc>
@@ -205,7 +205,7 @@
                 <w:sz w:val="44"/>
                 <w:szCs w:val="44"/>
               </w:rPr>
-              <w:t xml:space="preserve">107</w:t>
+              <w:t xml:space="preserve">108</w:t>
             </w:r>
           </w:p>
           <w:p>
@@ -361,7 +361,7 @@
           <w:sz w:val="20"/>
           <w:szCs w:val="20"/>
         </w:rPr>
-        <w:t xml:space="preserve">PR tem técnico atribuído em 78 das 78 ordens, com 77 encerradas. MG tem técnico atribuído em 20 das 20 ordens, com 20 encerradas. SP tem técnico atribuído em 13 das 13 ordens, com 10 encerradas.</w:t>
+        <w:t xml:space="preserve">PR tem técnico atribuído em 78 das 78 ordens, com 78 encerradas. MG tem técnico atribuído em 20 das 20 ordens, com 20 encerradas. SP tem técnico atribuído em 13 das 13 ordens, com 10 encerradas.</w:t>
       </w:r>
     </w:p>
     <w:tbl>
@@ -988,7 +988,7 @@
                 <w:sz w:val="24"/>
                 <w:szCs w:val="24"/>
               </w:rPr>
-              <w:t xml:space="preserve">77</w:t>
+              <w:t xml:space="preserve">78</w:t>
             </w:r>
           </w:p>
         </w:tc>

</xml_diff>